<commit_message>
feat(loan-document): add borrower personal-info merge fields + session log
LoanDocumentMergeDataResolver: FirstName/MiddleName/LastName (from
PersonName), DateOfBirth, Gender, CivilStatus, Nationality,
Occupation (closest available: incomeDetail.position - not an exact
semantic match, flagged to user), Email, ContactNumber
(mobilePhone1) - all sourced from the existing Borrower entity, none
previously exposed to generated documents.

MANULIFE.docx: user wired in new placeholders.

docs/SESSION_LOG_2026-07-14.md: full session log update covering the
font/tofu-box fix, two origin/main merges, the local DB wipe
incident (Sync Database From Export.bat) and recovery, the new
schema-safe sync script, SML document template mapping, and
remaining template placeholder work.

Co-Authored-By: Claude Sonnet 5 <noreply@anthropic.com>
</commit_message>
<xml_diff>
--- a/app/backend/templates/MANULIFE.docx
+++ b/app/backend/templates/MANULIFE.docx
@@ -582,7 +582,33 @@
         <w:ind w:left="304"/>
       </w:pPr>
       <w:r>
-        <w:t xml:space="preserve">First Name:  Middle Name:  Last Name: </w:t>
+        <w:t xml:space="preserve">First Name:  </w:t>
+      </w:r>
+      <w:r>
+        <w:t>{FirstName}</w:t>
+      </w:r>
+      <w:r>
+        <w:t xml:space="preserve"> </w:t>
+      </w:r>
+      <w:r>
+        <w:t xml:space="preserve">Middle Name: </w:t>
+      </w:r>
+      <w:r>
+        <w:t>{</w:t>
+      </w:r>
+      <w:proofErr w:type="spellStart"/>
+      <w:r>
+        <w:t>MiddleName</w:t>
+      </w:r>
+      <w:proofErr w:type="spellEnd"/>
+      <w:r>
+        <w:t>}</w:t>
+      </w:r>
+      <w:r>
+        <w:t xml:space="preserve"> Last Name: </w:t>
+      </w:r>
+      <w:r>
+        <w:t>{LastName}</w:t>
       </w:r>
     </w:p>
     <w:p>
@@ -591,7 +617,67 @@
         <w:ind w:left="304" w:right="3262"/>
       </w:pPr>
       <w:r>
-        <w:t>Date of Birth:  Gender: Civil Status:  Place of Birth:  Nationality:  Present Address (Number, Street, Apartment, Barangay/Town, Municipality, City/Province, ZIP Code)</w:t>
+        <w:t xml:space="preserve">Date of Birth: </w:t>
+      </w:r>
+      <w:r>
+        <w:t>{</w:t>
+      </w:r>
+      <w:proofErr w:type="spellStart"/>
+      <w:r>
+        <w:t>DateOfBirth</w:t>
+      </w:r>
+      <w:proofErr w:type="spellEnd"/>
+      <w:r>
+        <w:t>}</w:t>
+      </w:r>
+      <w:r>
+        <w:t xml:space="preserve"> Gender:</w:t>
+      </w:r>
+      <w:r>
+        <w:t xml:space="preserve"> </w:t>
+      </w:r>
+      <w:r>
+        <w:t>{Gender}</w:t>
+      </w:r>
+      <w:r>
+        <w:t xml:space="preserve"> Civil Status:  </w:t>
+      </w:r>
+      <w:r>
+        <w:t>{</w:t>
+      </w:r>
+      <w:proofErr w:type="spellStart"/>
+      <w:r>
+        <w:t>CivilStatus</w:t>
+      </w:r>
+      <w:proofErr w:type="spellEnd"/>
+      <w:r>
+        <w:t>}</w:t>
+      </w:r>
+      <w:r>
+        <w:t xml:space="preserve"> </w:t>
+      </w:r>
+      <w:r>
+        <w:t xml:space="preserve">Place of Birth:  Nationality: </w:t>
+      </w:r>
+      <w:r>
+        <w:t>{Nationality}</w:t>
+      </w:r>
+      <w:r>
+        <w:t xml:space="preserve"> Present Address </w:t>
+      </w:r>
+      <w:r>
+        <w:t xml:space="preserve"> </w:t>
+      </w:r>
+      <w:r>
+        <w:rPr>
+          <w:sz w:val="14"/>
+          <w:szCs w:val="14"/>
+          <w:lang w:val="en"/>
+        </w:rPr>
+        <w:t>{Address}</w:t>
+      </w:r>
+      <w:r>
+        <w:t xml:space="preserve">  </w:t>
       </w:r>
     </w:p>
     <w:p>
@@ -612,6 +698,10 @@
         </w:tabs>
         <w:spacing w:line="171" w:lineRule="exact"/>
         <w:ind w:left="304"/>
+        <w:rPr>
+          <w:sz w:val="11"/>
+          <w:szCs w:val="11"/>
+        </w:rPr>
       </w:pPr>
       <w:r>
         <w:t xml:space="preserve">SSS/GIS or </w:t>
@@ -641,28 +731,26 @@
         <w:t xml:space="preserve"> </w:t>
       </w:r>
       <w:r>
-        <w:t>Occupation:</w:t>
-      </w:r>
-      <w:r>
-        <w:rPr>
-          <w:u w:val="single"/>
-        </w:rPr>
+        <w:t>Occupation</w:t>
+      </w:r>
+      <w:r>
+        <w:t xml:space="preserve">: </w:t>
+      </w:r>
+      <w:r>
+        <w:t>{Occupation}</w:t>
+      </w:r>
+      <w:r>
         <w:t xml:space="preserve"> </w:t>
       </w:r>
       <w:r>
-        <w:rPr>
-          <w:u w:val="single"/>
-        </w:rPr>
-        <w:tab/>
-      </w:r>
-      <w:r>
         <w:t xml:space="preserve">Email Address: </w:t>
       </w:r>
-      <w:hyperlink r:id="rId5">
-        <w:r>
-          <w:t xml:space="preserve">onerarcm0053612@gmail.com </w:t>
-        </w:r>
-      </w:hyperlink>
+      <w:r>
+        <w:t>{Email}</w:t>
+      </w:r>
+      <w:r>
+        <w:t xml:space="preserve"> </w:t>
+      </w:r>
       <w:r>
         <w:t>Contact No.:</w:t>
       </w:r>
@@ -673,7 +761,44 @@
         <w:t xml:space="preserve"> </w:t>
       </w:r>
       <w:r>
+        <w:rPr>
+          <w:spacing w:val="-1"/>
+        </w:rPr>
+        <w:t>{</w:t>
+      </w:r>
+      <w:proofErr w:type="spellStart"/>
+      <w:r>
+        <w:rPr>
+          <w:spacing w:val="-1"/>
+        </w:rPr>
+        <w:t>ContactNumber</w:t>
+      </w:r>
+      <w:proofErr w:type="spellEnd"/>
+      <w:r>
+        <w:rPr>
+          <w:spacing w:val="-1"/>
+        </w:rPr>
+        <w:t>}</w:t>
+      </w:r>
+      <w:r>
+        <w:rPr>
+          <w:spacing w:val="-1"/>
+        </w:rPr>
+        <w:t xml:space="preserve"> </w:t>
+      </w:r>
+      <w:r>
         <w:t>Residence:</w:t>
+      </w:r>
+      <w:r>
+        <w:t xml:space="preserve"> </w:t>
+      </w:r>
+      <w:r>
+        <w:rPr>
+          <w:sz w:val="14"/>
+          <w:szCs w:val="14"/>
+          <w:lang w:val="en"/>
+        </w:rPr>
+        <w:t>{Address}</w:t>
       </w:r>
     </w:p>
     <w:p>
@@ -719,6 +844,26 @@
       <w:r>
         <w:t>Contact Number:</w:t>
       </w:r>
+      <w:r>
+        <w:rPr>
+          <w:rFonts w:ascii="Courier New" w:hAnsi="Courier New" w:cs="Courier New"/>
+          <w:color w:val="E2E1DA"/>
+          <w:sz w:val="20"/>
+          <w:szCs w:val="20"/>
+        </w:rPr>
+        <w:t xml:space="preserve"> </w:t>
+      </w:r>
+      <w:r>
+        <w:t>{</w:t>
+      </w:r>
+      <w:proofErr w:type="spellStart"/>
+      <w:r>
+        <w:t>ContactNumber</w:t>
+      </w:r>
+      <w:proofErr w:type="spellEnd"/>
+      <w:r>
+        <w:t>}</w:t>
+      </w:r>
     </w:p>
     <w:p>
       <w:pPr>
@@ -728,14 +873,38 @@
         </w:tabs>
         <w:spacing w:line="172" w:lineRule="exact"/>
         <w:ind w:left="304"/>
-      </w:pPr>
-      <w:r>
-        <w:t>Amount of Loan: 114,316.85</w:t>
-      </w:r>
-      <w:r>
-        <w:rPr>
-          <w:spacing w:val="12"/>
-        </w:rPr>
+        <w:rPr>
+          <w:sz w:val="13"/>
+          <w:szCs w:val="13"/>
+        </w:rPr>
+      </w:pPr>
+      <w:r>
+        <w:t xml:space="preserve">Amount of Loan: </w:t>
+      </w:r>
+      <w:r>
+        <w:rPr>
+          <w:sz w:val="18"/>
+          <w:szCs w:val="18"/>
+        </w:rPr>
+        <w:t>{</w:t>
+      </w:r>
+      <w:proofErr w:type="spellStart"/>
+      <w:r>
+        <w:rPr>
+          <w:sz w:val="14"/>
+          <w:szCs w:val="14"/>
+        </w:rPr>
+        <w:t>PrincipalAmount</w:t>
+      </w:r>
+      <w:proofErr w:type="spellEnd"/>
+      <w:r>
+        <w:rPr>
+          <w:sz w:val="14"/>
+          <w:szCs w:val="14"/>
+        </w:rPr>
+        <w:t>}</w:t>
+      </w:r>
+      <w:r>
         <w:t xml:space="preserve"> </w:t>
       </w:r>
       <w:r>
@@ -750,16 +919,34 @@
       <w:r>
         <w:rPr>
           <w:spacing w:val="-4"/>
-          <w:u w:val="single"/>
         </w:rPr>
         <w:t xml:space="preserve"> </w:t>
       </w:r>
       <w:r>
         <w:rPr>
           <w:spacing w:val="-4"/>
-          <w:u w:val="single"/>
-        </w:rPr>
-        <w:tab/>
+        </w:rPr>
+        <w:t>{</w:t>
+      </w:r>
+      <w:proofErr w:type="spellStart"/>
+      <w:r>
+        <w:rPr>
+          <w:spacing w:val="-4"/>
+        </w:rPr>
+        <w:t>NumberOfInstallments</w:t>
+      </w:r>
+      <w:proofErr w:type="spellEnd"/>
+      <w:r>
+        <w:rPr>
+          <w:spacing w:val="-4"/>
+        </w:rPr>
+        <w:t>}</w:t>
+      </w:r>
+      <w:r>
+        <w:rPr>
+          <w:spacing w:val="-4"/>
+        </w:rPr>
+        <w:t xml:space="preserve">  </w:t>
       </w:r>
       <w:r>
         <w:t>Maturity Date</w:t>
@@ -771,7 +958,27 @@
         <w:t xml:space="preserve"> </w:t>
       </w:r>
       <w:r>
-        <w:t>09/15/2026</w:t>
+        <w:rPr>
+          <w:sz w:val="14"/>
+          <w:szCs w:val="14"/>
+        </w:rPr>
+        <w:t>{</w:t>
+      </w:r>
+      <w:proofErr w:type="spellStart"/>
+      <w:r>
+        <w:rPr>
+          <w:sz w:val="14"/>
+          <w:szCs w:val="14"/>
+        </w:rPr>
+        <w:t>MaturityDate</w:t>
+      </w:r>
+      <w:proofErr w:type="spellEnd"/>
+      <w:r>
+        <w:rPr>
+          <w:sz w:val="14"/>
+          <w:szCs w:val="14"/>
+        </w:rPr>
+        <w:t>}</w:t>
       </w:r>
     </w:p>
     <w:p>
@@ -1499,7 +1706,15 @@
         <w:t xml:space="preserve"> </w:t>
       </w:r>
       <w:r>
-        <w:t xml:space="preserve">beneficiary/ies: </w:t>
+        <w:t>beneficiary/</w:t>
+      </w:r>
+      <w:proofErr w:type="spellStart"/>
+      <w:r>
+        <w:t>ies</w:t>
+      </w:r>
+      <w:proofErr w:type="spellEnd"/>
+      <w:r>
+        <w:t xml:space="preserve">: </w:t>
       </w:r>
       <w:r>
         <w:rPr>
@@ -1639,7 +1854,21 @@
               <w:rPr>
                 <w:sz w:val="15"/>
               </w:rPr>
-              <w:t>country/ies:</w:t>
+              <w:t>country/</w:t>
+            </w:r>
+            <w:proofErr w:type="spellStart"/>
+            <w:r>
+              <w:rPr>
+                <w:sz w:val="15"/>
+              </w:rPr>
+              <w:t>ies</w:t>
+            </w:r>
+            <w:proofErr w:type="spellEnd"/>
+            <w:r>
+              <w:rPr>
+                <w:sz w:val="15"/>
+              </w:rPr>
+              <w:t>:</w:t>
             </w:r>
           </w:p>
           <w:p>
@@ -1697,7 +1926,21 @@
               <w:rPr>
                 <w:sz w:val="15"/>
               </w:rPr>
-              <w:t xml:space="preserve">If yes. Please specify the country/ies: Are you currently working or residing in another country? </w:t>
+              <w:t>If yes. Please specify the country/</w:t>
+            </w:r>
+            <w:proofErr w:type="spellStart"/>
+            <w:r>
+              <w:rPr>
+                <w:sz w:val="15"/>
+              </w:rPr>
+              <w:t>ies</w:t>
+            </w:r>
+            <w:proofErr w:type="spellEnd"/>
+            <w:r>
+              <w:rPr>
+                <w:sz w:val="15"/>
+              </w:rPr>
+              <w:t xml:space="preserve">: Are you currently working or residing in another country? </w:t>
             </w:r>
             <w:r>
               <w:rPr>
@@ -1745,7 +1988,21 @@
               <w:rPr>
                 <w:sz w:val="15"/>
               </w:rPr>
-              <w:t>country/ies:</w:t>
+              <w:t>country/</w:t>
+            </w:r>
+            <w:proofErr w:type="spellStart"/>
+            <w:r>
+              <w:rPr>
+                <w:sz w:val="15"/>
+              </w:rPr>
+              <w:t>ies</w:t>
+            </w:r>
+            <w:proofErr w:type="spellEnd"/>
+            <w:r>
+              <w:rPr>
+                <w:sz w:val="15"/>
+              </w:rPr>
+              <w:t>:</w:t>
             </w:r>
           </w:p>
         </w:tc>
@@ -1863,7 +2120,21 @@
               <w:rPr>
                 <w:sz w:val="15"/>
               </w:rPr>
-              <w:t>country/ies:</w:t>
+              <w:t>country/</w:t>
+            </w:r>
+            <w:proofErr w:type="spellStart"/>
+            <w:r>
+              <w:rPr>
+                <w:sz w:val="15"/>
+              </w:rPr>
+              <w:t>ies</w:t>
+            </w:r>
+            <w:proofErr w:type="spellEnd"/>
+            <w:r>
+              <w:rPr>
+                <w:sz w:val="15"/>
+              </w:rPr>
+              <w:t>:</w:t>
             </w:r>
           </w:p>
           <w:p>
@@ -2331,7 +2602,21 @@
               <w:rPr>
                 <w:sz w:val="15"/>
               </w:rPr>
-              <w:t xml:space="preserve">"We", "Us", or "Our") hereby agrees to pay the Benefits to the designated Beneficiary/ies upon receipt of satisfactory proof of death of such persons (herein referred to </w:t>
+              <w:t>"We", "Us", or "Our") hereby agrees to pay the Benefits to the designated Beneficiary/</w:t>
+            </w:r>
+            <w:proofErr w:type="spellStart"/>
+            <w:r>
+              <w:rPr>
+                <w:sz w:val="15"/>
+              </w:rPr>
+              <w:t>ies</w:t>
+            </w:r>
+            <w:proofErr w:type="spellEnd"/>
+            <w:r>
+              <w:rPr>
+                <w:sz w:val="15"/>
+              </w:rPr>
+              <w:t xml:space="preserve"> upon receipt of satisfactory proof of death of such persons (herein referred to </w:t>
             </w:r>
             <w:r>
               <w:rPr>
@@ -2678,7 +2963,21 @@
               <w:rPr>
                 <w:sz w:val="15"/>
               </w:rPr>
-              <w:t>The Policy provides that any death benefits paid thereunder shall be first applied by the Creditor towards the payment of your indebtedness to the Creditor. Any amounts in excess of your indebtedness shall be paid to your designated beneficiary/ies.</w:t>
+              <w:t>The Policy provides that any death benefits paid thereunder shall be first applied by the Creditor towards the payment of your indebtedness to the Creditor. Any amounts in excess of your indebtedness shall be paid to your designated beneficiary/</w:t>
+            </w:r>
+            <w:proofErr w:type="spellStart"/>
+            <w:r>
+              <w:rPr>
+                <w:sz w:val="15"/>
+              </w:rPr>
+              <w:t>ies</w:t>
+            </w:r>
+            <w:proofErr w:type="spellEnd"/>
+            <w:r>
+              <w:rPr>
+                <w:sz w:val="15"/>
+              </w:rPr>
+              <w:t>.</w:t>
             </w:r>
           </w:p>
           <w:p>
@@ -2893,7 +3192,15 @@
         <w:t xml:space="preserve">Bureau </w:t>
       </w:r>
       <w:r>
-        <w:t>and uploaded to the Medical Information Database, within the rules set by the Data Privacy Act, relevant regulations and Menulife's privacy policy, for the following purposes:</w:t>
+        <w:t xml:space="preserve">and uploaded to the Medical Information Database, within the rules set by the Data Privacy Act, relevant regulations and </w:t>
+      </w:r>
+      <w:proofErr w:type="spellStart"/>
+      <w:r>
+        <w:t>Menulife's</w:t>
+      </w:r>
+      <w:proofErr w:type="spellEnd"/>
+      <w:r>
+        <w:t xml:space="preserve"> privacy policy, for the following purposes:</w:t>
       </w:r>
     </w:p>
     <w:p>
@@ -3679,7 +3986,29 @@
                 <w:szCs w:val="16"/>
                 <w:u w:val="single"/>
               </w:rPr>
-              <w:t>{BorrowerName}</w:t>
+              <w:t>{</w:t>
+            </w:r>
+            <w:proofErr w:type="spellStart"/>
+            <w:r>
+              <w:rPr>
+                <w:b/>
+                <w:bCs/>
+                <w:sz w:val="16"/>
+                <w:szCs w:val="16"/>
+                <w:u w:val="single"/>
+              </w:rPr>
+              <w:t>BorrowerName</w:t>
+            </w:r>
+            <w:proofErr w:type="spellEnd"/>
+            <w:r>
+              <w:rPr>
+                <w:b/>
+                <w:bCs/>
+                <w:sz w:val="16"/>
+                <w:szCs w:val="16"/>
+                <w:u w:val="single"/>
+              </w:rPr>
+              <w:t>}</w:t>
             </w:r>
           </w:p>
           <w:p>
@@ -5330,6 +5659,7 @@
               </w:rPr>
               <w:t xml:space="preserve">The Insurance Commission, with offices in Manila, Cebu, and Davao, is the government office in charge of the enforcement of all laws relating to insurance and has supervision over insurance companies. It is ready at all times to assist the general public in matters pertaining to insurance. For any inquiries or complaints, please contact the Public Assistance and Mediation Division (PAMD) of the Insurance Commission at 1071 United Nations Avenue, Manila, with telephone numbers +632-5238461 to 70 and email address </w:t>
             </w:r>
+            <w:proofErr w:type="spellStart"/>
             <w:r>
               <w:rPr>
                 <w:sz w:val="15"/>
@@ -5340,7 +5670,14 @@
               <w:rPr>
                 <w:sz w:val="15"/>
               </w:rPr>
-              <w:t xml:space="preserve">The official website of the Insurance Commission is </w:t>
+              <w:t>The</w:t>
+            </w:r>
+            <w:proofErr w:type="spellEnd"/>
+            <w:r>
+              <w:rPr>
+                <w:sz w:val="15"/>
+              </w:rPr>
+              <w:t xml:space="preserve"> official website of the Insurance Commission is </w:t>
             </w:r>
             <w:r>
               <w:rPr>
@@ -6514,7 +6851,6 @@
   <w:style w:type="character" w:default="1" w:styleId="DefaultParagraphFont">
     <w:name w:val="Default Paragraph Font"/>
     <w:uiPriority w:val="1"/>
-    <w:semiHidden/>
     <w:unhideWhenUsed/>
   </w:style>
   <w:style w:type="table" w:default="1" w:styleId="TableNormal">

</xml_diff>